<commit_message>
changed up the text
</commit_message>
<xml_diff>
--- a/book-scrape/project specifications.docx
+++ b/book-scrape/project specifications.docx
@@ -26,85 +26,386 @@
         <w:t>By Leo, Jose, Bo</w:t>
       </w:r>
     </w:p>
+    <w:p>
+      <w:pPr>
+        <w:rPr>
+          <w:b/>
+          <w:bCs/>
+        </w:rPr>
+      </w:pPr>
+      <w:r>
+        <w:rPr>
+          <w:b/>
+          <w:bCs/>
+        </w:rPr>
+        <w:t>Project Rationale</w:t>
+      </w:r>
+    </w:p>
+    <w:p>
+      <w:r>
+        <w:t xml:space="preserve">This program is a menu-based application that scrapes book data from </w:t>
+      </w:r>
+      <w:r>
+        <w:rPr>
+          <w:i/>
+          <w:iCs/>
+        </w:rPr>
+        <w:t>books.toscrape.com</w:t>
+      </w:r>
+      <w:r>
+        <w:t>. It allows users to view and search book information such as title, price, availability, and rating. The program is useful because it provides a simple way to explore book data collected from a website.</w:t>
+      </w:r>
+    </w:p>
+    <w:p>
+      <w:r>
+        <w:rPr>
+          <w:b/>
+          <w:bCs/>
+        </w:rPr>
+        <w:t>Implementation Details</w:t>
+      </w:r>
+    </w:p>
+    <w:p>
+      <w:r>
+        <w:rPr>
+          <w:noProof/>
+        </w:rPr>
+        <w:drawing>
+          <wp:inline distT="0" distB="0" distL="0" distR="0" wp14:anchorId="4B170A92" wp14:editId="40797303">
+            <wp:extent cx="5943600" cy="3713480"/>
+            <wp:effectExtent l="0" t="0" r="0" b="1270"/>
+            <wp:docPr id="1" name="Picture 1"/>
+            <wp:cNvGraphicFramePr>
+              <a:graphicFrameLocks xmlns:a="http://schemas.openxmlformats.org/drawingml/2006/main" noChangeAspect="1"/>
+            </wp:cNvGraphicFramePr>
+            <a:graphic xmlns:a="http://schemas.openxmlformats.org/drawingml/2006/main">
+              <a:graphicData uri="http://schemas.openxmlformats.org/drawingml/2006/picture">
+                <pic:pic xmlns:pic="http://schemas.openxmlformats.org/drawingml/2006/picture">
+                  <pic:nvPicPr>
+                    <pic:cNvPr id="1" name="Picture 1"/>
+                    <pic:cNvPicPr/>
+                  </pic:nvPicPr>
+                  <pic:blipFill>
+                    <a:blip r:embed="rId5" cstate="print">
+                      <a:extLst>
+                        <a:ext uri="{28A0092B-C50C-407E-A947-70E740481C1C}">
+                          <a14:useLocalDpi xmlns:a14="http://schemas.microsoft.com/office/drawing/2010/main" val="0"/>
+                        </a:ext>
+                      </a:extLst>
+                    </a:blip>
+                    <a:stretch>
+                      <a:fillRect/>
+                    </a:stretch>
+                  </pic:blipFill>
+                  <pic:spPr>
+                    <a:xfrm>
+                      <a:off x="0" y="0"/>
+                      <a:ext cx="5943600" cy="3713480"/>
+                    </a:xfrm>
+                    <a:prstGeom prst="rect">
+                      <a:avLst/>
+                    </a:prstGeom>
+                  </pic:spPr>
+                </pic:pic>
+              </a:graphicData>
+            </a:graphic>
+          </wp:inline>
+        </w:drawing>
+      </w:r>
+    </w:p>
     <w:p/>
     <w:p>
-      <w:r>
-        <w:t xml:space="preserve">The program will start in a MENU with a heading and </w:t>
-      </w:r>
-      <w:r>
-        <w:t>LIST</w:t>
-      </w:r>
-      <w:r>
-        <w:t xml:space="preserve"> </w:t>
-      </w:r>
-      <w:r>
-        <w:t xml:space="preserve">OF </w:t>
-      </w:r>
-      <w:r>
-        <w:t xml:space="preserve">CHOICES of the different possible applications within in the program. The user will be able to get certain kinds of INFORMATION about books scraped from the </w:t>
-      </w:r>
-      <w:r>
-        <w:t>website “</w:t>
-      </w:r>
-      <w:hyperlink r:id="rId4" w:history="1">
-        <w:r>
-          <w:t>books.toscrape.com</w:t>
-        </w:r>
-      </w:hyperlink>
-      <w:r>
-        <w:t>”</w:t>
-      </w:r>
-      <w:r>
-        <w:t xml:space="preserve">. </w:t>
+      <w:pPr>
+        <w:rPr>
+          <w:b/>
+          <w:bCs/>
+        </w:rPr>
+      </w:pPr>
+      <w:r>
+        <w:rPr>
+          <w:b/>
+          <w:bCs/>
+        </w:rPr>
+        <w:t>User Documentation</w:t>
       </w:r>
     </w:p>
     <w:p>
-      <w:r>
-        <w:t xml:space="preserve">These include LISTS like </w:t>
-      </w:r>
-      <w:r>
-        <w:t>ALPHABETICAL</w:t>
-      </w:r>
-      <w:r>
-        <w:t xml:space="preserve"> BOOK TITLE</w:t>
-      </w:r>
-      <w:r>
-        <w:t>, BEST STAR RATED, MOST SOLD, PRICE (UP/DOWN), and a SEARCH FUNCTION for the BOOKS NAME</w:t>
-      </w:r>
-      <w:r>
-        <w:t xml:space="preserve">, </w:t>
-      </w:r>
-      <w:r>
-        <w:t>the AUTHOR</w:t>
-      </w:r>
-      <w:r>
-        <w:t>, or the GENRE</w:t>
-      </w:r>
-      <w:r>
-        <w:t xml:space="preserve">. </w:t>
-      </w:r>
-      <w:r>
-        <w:t xml:space="preserve">Each choice can be viewed in a FILTER OF THAT SPECIFIC GENRE. </w:t>
-      </w:r>
-      <w:proofErr w:type="gramStart"/>
-      <w:r>
-        <w:t>Also</w:t>
-      </w:r>
-      <w:proofErr w:type="gramEnd"/>
-      <w:r>
-        <w:t xml:space="preserve"> the YEAR and the AMOUNT IN STORAGE are visible. </w:t>
+      <w:pPr>
+        <w:rPr>
+          <w:b/>
+          <w:bCs/>
+        </w:rPr>
+      </w:pPr>
+      <w:r>
+        <w:rPr>
+          <w:b/>
+          <w:bCs/>
+        </w:rPr>
+        <w:t>How to Run the Program:</w:t>
       </w:r>
     </w:p>
     <w:p>
+      <w:pPr>
+        <w:numPr>
+          <w:ilvl w:val="0"/>
+          <w:numId w:val="3"/>
+        </w:numPr>
+        <w:rPr>
+          <w:b/>
+          <w:bCs/>
+        </w:rPr>
+      </w:pPr>
+      <w:r>
+        <w:rPr>
+          <w:b/>
+          <w:bCs/>
+        </w:rPr>
+        <w:t xml:space="preserve">Run the Python file. </w:t>
+      </w:r>
+    </w:p>
+    <w:p>
+      <w:pPr>
+        <w:numPr>
+          <w:ilvl w:val="0"/>
+          <w:numId w:val="3"/>
+        </w:numPr>
+        <w:rPr>
+          <w:b/>
+          <w:bCs/>
+        </w:rPr>
+      </w:pPr>
+      <w:r>
+        <w:rPr>
+          <w:b/>
+          <w:bCs/>
+        </w:rPr>
+        <w:t xml:space="preserve">The program will automatically scrape book data and save it to </w:t>
+      </w:r>
+      <w:proofErr w:type="spellStart"/>
       <w:proofErr w:type="gramStart"/>
       <w:r>
-        <w:t>Additionally</w:t>
-      </w:r>
+        <w:rPr>
+          <w:b/>
+          <w:bCs/>
+        </w:rPr>
+        <w:t>library.json</w:t>
+      </w:r>
+      <w:proofErr w:type="spellEnd"/>
       <w:proofErr w:type="gramEnd"/>
       <w:r>
-        <w:t xml:space="preserve"> you can END the program by choice in the menu. </w:t>
+        <w:rPr>
+          <w:b/>
+          <w:bCs/>
+        </w:rPr>
+        <w:t xml:space="preserve">. </w:t>
       </w:r>
     </w:p>
+    <w:p>
+      <w:pPr>
+        <w:numPr>
+          <w:ilvl w:val="0"/>
+          <w:numId w:val="3"/>
+        </w:numPr>
+        <w:rPr>
+          <w:b/>
+          <w:bCs/>
+        </w:rPr>
+      </w:pPr>
+      <w:r>
+        <w:rPr>
+          <w:b/>
+          <w:bCs/>
+        </w:rPr>
+        <w:t xml:space="preserve">The menu will then appear. </w:t>
+      </w:r>
+    </w:p>
+    <w:p>
+      <w:pPr>
+        <w:rPr>
+          <w:b/>
+          <w:bCs/>
+        </w:rPr>
+      </w:pPr>
+      <w:r>
+        <w:rPr>
+          <w:b/>
+          <w:bCs/>
+        </w:rPr>
+        <w:t>How to Use the Features:</w:t>
+      </w:r>
+    </w:p>
+    <w:p>
+      <w:pPr>
+        <w:numPr>
+          <w:ilvl w:val="0"/>
+          <w:numId w:val="4"/>
+        </w:numPr>
+        <w:rPr>
+          <w:b/>
+          <w:bCs/>
+        </w:rPr>
+      </w:pPr>
+      <w:r>
+        <w:rPr>
+          <w:b/>
+          <w:bCs/>
+        </w:rPr>
+        <w:lastRenderedPageBreak/>
+        <w:t xml:space="preserve">Enter a number from the menu: </w:t>
+      </w:r>
+    </w:p>
+    <w:p>
+      <w:pPr>
+        <w:numPr>
+          <w:ilvl w:val="1"/>
+          <w:numId w:val="4"/>
+        </w:numPr>
+        <w:rPr>
+          <w:b/>
+          <w:bCs/>
+        </w:rPr>
+      </w:pPr>
+      <w:r>
+        <w:rPr>
+          <w:b/>
+          <w:bCs/>
+        </w:rPr>
+        <w:t xml:space="preserve">1 </w:t>
+      </w:r>
+      <w:r>
+        <w:rPr>
+          <w:b/>
+          <w:bCs/>
+        </w:rPr>
+        <w:t>-</w:t>
+      </w:r>
+      <w:r>
+        <w:rPr>
+          <w:b/>
+          <w:bCs/>
+        </w:rPr>
+        <w:t xml:space="preserve"> View all books: Displays all books with title, price, and rating. </w:t>
+      </w:r>
+    </w:p>
+    <w:p>
+      <w:pPr>
+        <w:numPr>
+          <w:ilvl w:val="1"/>
+          <w:numId w:val="4"/>
+        </w:numPr>
+        <w:rPr>
+          <w:b/>
+          <w:bCs/>
+        </w:rPr>
+      </w:pPr>
+      <w:r>
+        <w:rPr>
+          <w:b/>
+          <w:bCs/>
+        </w:rPr>
+        <w:t xml:space="preserve">2 </w:t>
+      </w:r>
+      <w:r>
+        <w:rPr>
+          <w:b/>
+          <w:bCs/>
+        </w:rPr>
+        <w:t>-</w:t>
+      </w:r>
+      <w:r>
+        <w:rPr>
+          <w:b/>
+          <w:bCs/>
+        </w:rPr>
+        <w:t xml:space="preserve"> Search book by title: Enter a keyword to find matching book titles. </w:t>
+      </w:r>
+    </w:p>
+    <w:p>
+      <w:pPr>
+        <w:numPr>
+          <w:ilvl w:val="1"/>
+          <w:numId w:val="4"/>
+        </w:numPr>
+        <w:rPr>
+          <w:b/>
+          <w:bCs/>
+        </w:rPr>
+      </w:pPr>
+      <w:r>
+        <w:rPr>
+          <w:b/>
+          <w:bCs/>
+        </w:rPr>
+        <w:t xml:space="preserve">3 </w:t>
+      </w:r>
+      <w:r>
+        <w:rPr>
+          <w:b/>
+          <w:bCs/>
+        </w:rPr>
+        <w:t>-</w:t>
+      </w:r>
+      <w:r>
+        <w:rPr>
+          <w:b/>
+          <w:bCs/>
+        </w:rPr>
+        <w:t xml:space="preserve"> Filter by rating: Enter a number (1–5) to view books with that rating. </w:t>
+      </w:r>
+    </w:p>
+    <w:p>
+      <w:pPr>
+        <w:numPr>
+          <w:ilvl w:val="1"/>
+          <w:numId w:val="4"/>
+        </w:numPr>
+        <w:rPr>
+          <w:b/>
+          <w:bCs/>
+        </w:rPr>
+      </w:pPr>
+      <w:r>
+        <w:rPr>
+          <w:b/>
+          <w:bCs/>
+        </w:rPr>
+        <w:t xml:space="preserve">4 </w:t>
+      </w:r>
+      <w:r>
+        <w:rPr>
+          <w:b/>
+          <w:bCs/>
+        </w:rPr>
+        <w:t>-</w:t>
+      </w:r>
+      <w:r>
+        <w:rPr>
+          <w:b/>
+          <w:bCs/>
+        </w:rPr>
+        <w:t xml:space="preserve"> Exit: Closes the program. </w:t>
+      </w:r>
+    </w:p>
+    <w:p>
+      <w:pPr>
+        <w:numPr>
+          <w:ilvl w:val="0"/>
+          <w:numId w:val="4"/>
+        </w:numPr>
+        <w:rPr>
+          <w:b/>
+          <w:bCs/>
+        </w:rPr>
+      </w:pPr>
+      <w:r>
+        <w:rPr>
+          <w:b/>
+          <w:bCs/>
+        </w:rPr>
+        <w:t xml:space="preserve">If an invalid option or rating is entered, the program will show an error message. </w:t>
+      </w:r>
+    </w:p>
+    <w:p/>
     <w:sectPr>
       <w:pgSz w:w="12240" w:h="15840"/>
       <w:pgMar w:top="1440" w:right="1440" w:bottom="1440" w:left="1440" w:header="720" w:footer="720" w:gutter="0"/>
@@ -113,6 +414,547 @@
     </w:sectPr>
   </w:body>
 </w:document>
+</file>
+
+<file path=word/numbering.xml><?xml version="1.0" encoding="utf-8"?>
+<w:numbering xmlns:wpc="http://schemas.microsoft.com/office/word/2010/wordprocessingCanvas" xmlns:cx="http://schemas.microsoft.com/office/drawing/2014/chartex" xmlns:cx1="http://schemas.microsoft.com/office/drawing/2015/9/8/chartex" xmlns:cx2="http://schemas.microsoft.com/office/drawing/2015/10/21/chartex" xmlns:cx3="http://schemas.microsoft.com/office/drawing/2016/5/9/chartex" xmlns:cx4="http://schemas.microsoft.com/office/drawing/2016/5/10/chartex" xmlns:cx5="http://schemas.microsoft.com/office/drawing/2016/5/11/chartex" xmlns:cx6="http://schemas.microsoft.com/office/drawing/2016/5/12/chartex" xmlns:cx7="http://schemas.microsoft.com/office/drawing/2016/5/13/chartex" xmlns:cx8="http://schemas.microsoft.com/office/drawing/2016/5/14/chartex" xmlns:mc="http://schemas.openxmlformats.org/markup-compatibility/2006" xmlns:aink="http://schemas.microsoft.com/office/drawing/2016/ink" xmlns:am3d="http://schemas.microsoft.com/office/drawing/2017/model3d" xmlns:o="urn:schemas-microsoft-com:office:office" xmlns:oel="http://schemas.microsoft.com/office/2019/extlst" xmlns:r="http://schemas.openxmlformats.org/officeDocument/2006/relationships" xmlns:m="http://schemas.openxmlformats.org/officeDocument/2006/math" xmlns:v="urn:schemas-microsoft-com:vml" xmlns:wp14="http://schemas.microsoft.com/office/word/2010/wordprocessingDrawing" xmlns:wp="http://schemas.openxmlformats.org/drawingml/2006/wordprocessingDrawing" xmlns:w10="urn:schemas-microsoft-com:office:word" xmlns:w="http://schemas.openxmlformats.org/wordprocessingml/2006/main" xmlns:w14="http://schemas.microsoft.com/office/word/2010/wordml" xmlns:w15="http://schemas.microsoft.com/office/word/2012/wordml" xmlns:w16cex="http://schemas.microsoft.com/office/word/2018/wordml/cex" xmlns:w16cid="http://schemas.microsoft.com/office/word/2016/wordml/cid" xmlns:w16="http://schemas.microsoft.com/office/word/2018/wordml" xmlns:w16sdtdh="http://schemas.microsoft.com/office/word/2020/wordml/sdtdatahash" xmlns:w16se="http://schemas.microsoft.com/office/word/2015/wordml/symex" xmlns:wpg="http://schemas.microsoft.com/office/word/2010/wordprocessingGroup" xmlns:wpi="http://schemas.microsoft.com/office/word/2010/wordprocessingInk" xmlns:wne="http://schemas.microsoft.com/office/word/2006/wordml" xmlns:wps="http://schemas.microsoft.com/office/word/2010/wordprocessingShape" mc:Ignorable="w14 w15 w16se w16cid w16 w16cex w16sdtdh wp14">
+  <w:abstractNum w:abstractNumId="0" w15:restartNumberingAfterBreak="0">
+    <w:nsid w:val="08FE1699"/>
+    <w:multiLevelType w:val="multilevel"/>
+    <w:tmpl w:val="1D24457C"/>
+    <w:lvl w:ilvl="0">
+      <w:start w:val="1"/>
+      <w:numFmt w:val="bullet"/>
+      <w:lvlText w:val=""/>
+      <w:lvlJc w:val="left"/>
+      <w:pPr>
+        <w:tabs>
+          <w:tab w:val="num" w:pos="720"/>
+        </w:tabs>
+        <w:ind w:left="720" w:hanging="360"/>
+      </w:pPr>
+      <w:rPr>
+        <w:rFonts w:ascii="Symbol" w:hAnsi="Symbol" w:hint="default"/>
+        <w:sz w:val="20"/>
+      </w:rPr>
+    </w:lvl>
+    <w:lvl w:ilvl="1">
+      <w:start w:val="1"/>
+      <w:numFmt w:val="bullet"/>
+      <w:lvlText w:val="o"/>
+      <w:lvlJc w:val="left"/>
+      <w:pPr>
+        <w:tabs>
+          <w:tab w:val="num" w:pos="1440"/>
+        </w:tabs>
+        <w:ind w:left="1440" w:hanging="360"/>
+      </w:pPr>
+      <w:rPr>
+        <w:rFonts w:ascii="Courier New" w:hAnsi="Courier New" w:hint="default"/>
+        <w:sz w:val="20"/>
+      </w:rPr>
+    </w:lvl>
+    <w:lvl w:ilvl="2" w:tentative="1">
+      <w:start w:val="1"/>
+      <w:numFmt w:val="bullet"/>
+      <w:lvlText w:val=""/>
+      <w:lvlJc w:val="left"/>
+      <w:pPr>
+        <w:tabs>
+          <w:tab w:val="num" w:pos="2160"/>
+        </w:tabs>
+        <w:ind w:left="2160" w:hanging="360"/>
+      </w:pPr>
+      <w:rPr>
+        <w:rFonts w:ascii="Wingdings" w:hAnsi="Wingdings" w:hint="default"/>
+        <w:sz w:val="20"/>
+      </w:rPr>
+    </w:lvl>
+    <w:lvl w:ilvl="3" w:tentative="1">
+      <w:start w:val="1"/>
+      <w:numFmt w:val="bullet"/>
+      <w:lvlText w:val=""/>
+      <w:lvlJc w:val="left"/>
+      <w:pPr>
+        <w:tabs>
+          <w:tab w:val="num" w:pos="2880"/>
+        </w:tabs>
+        <w:ind w:left="2880" w:hanging="360"/>
+      </w:pPr>
+      <w:rPr>
+        <w:rFonts w:ascii="Wingdings" w:hAnsi="Wingdings" w:hint="default"/>
+        <w:sz w:val="20"/>
+      </w:rPr>
+    </w:lvl>
+    <w:lvl w:ilvl="4" w:tentative="1">
+      <w:start w:val="1"/>
+      <w:numFmt w:val="bullet"/>
+      <w:lvlText w:val=""/>
+      <w:lvlJc w:val="left"/>
+      <w:pPr>
+        <w:tabs>
+          <w:tab w:val="num" w:pos="3600"/>
+        </w:tabs>
+        <w:ind w:left="3600" w:hanging="360"/>
+      </w:pPr>
+      <w:rPr>
+        <w:rFonts w:ascii="Wingdings" w:hAnsi="Wingdings" w:hint="default"/>
+        <w:sz w:val="20"/>
+      </w:rPr>
+    </w:lvl>
+    <w:lvl w:ilvl="5" w:tentative="1">
+      <w:start w:val="1"/>
+      <w:numFmt w:val="bullet"/>
+      <w:lvlText w:val=""/>
+      <w:lvlJc w:val="left"/>
+      <w:pPr>
+        <w:tabs>
+          <w:tab w:val="num" w:pos="4320"/>
+        </w:tabs>
+        <w:ind w:left="4320" w:hanging="360"/>
+      </w:pPr>
+      <w:rPr>
+        <w:rFonts w:ascii="Wingdings" w:hAnsi="Wingdings" w:hint="default"/>
+        <w:sz w:val="20"/>
+      </w:rPr>
+    </w:lvl>
+    <w:lvl w:ilvl="6" w:tentative="1">
+      <w:start w:val="1"/>
+      <w:numFmt w:val="bullet"/>
+      <w:lvlText w:val=""/>
+      <w:lvlJc w:val="left"/>
+      <w:pPr>
+        <w:tabs>
+          <w:tab w:val="num" w:pos="5040"/>
+        </w:tabs>
+        <w:ind w:left="5040" w:hanging="360"/>
+      </w:pPr>
+      <w:rPr>
+        <w:rFonts w:ascii="Wingdings" w:hAnsi="Wingdings" w:hint="default"/>
+        <w:sz w:val="20"/>
+      </w:rPr>
+    </w:lvl>
+    <w:lvl w:ilvl="7" w:tentative="1">
+      <w:start w:val="1"/>
+      <w:numFmt w:val="bullet"/>
+      <w:lvlText w:val=""/>
+      <w:lvlJc w:val="left"/>
+      <w:pPr>
+        <w:tabs>
+          <w:tab w:val="num" w:pos="5760"/>
+        </w:tabs>
+        <w:ind w:left="5760" w:hanging="360"/>
+      </w:pPr>
+      <w:rPr>
+        <w:rFonts w:ascii="Wingdings" w:hAnsi="Wingdings" w:hint="default"/>
+        <w:sz w:val="20"/>
+      </w:rPr>
+    </w:lvl>
+    <w:lvl w:ilvl="8" w:tentative="1">
+      <w:start w:val="1"/>
+      <w:numFmt w:val="bullet"/>
+      <w:lvlText w:val=""/>
+      <w:lvlJc w:val="left"/>
+      <w:pPr>
+        <w:tabs>
+          <w:tab w:val="num" w:pos="6480"/>
+        </w:tabs>
+        <w:ind w:left="6480" w:hanging="360"/>
+      </w:pPr>
+      <w:rPr>
+        <w:rFonts w:ascii="Wingdings" w:hAnsi="Wingdings" w:hint="default"/>
+        <w:sz w:val="20"/>
+      </w:rPr>
+    </w:lvl>
+  </w:abstractNum>
+  <w:abstractNum w:abstractNumId="1" w15:restartNumberingAfterBreak="0">
+    <w:nsid w:val="09CF71F6"/>
+    <w:multiLevelType w:val="multilevel"/>
+    <w:tmpl w:val="636201B2"/>
+    <w:lvl w:ilvl="0">
+      <w:start w:val="1"/>
+      <w:numFmt w:val="decimal"/>
+      <w:lvlText w:val="%1."/>
+      <w:lvlJc w:val="left"/>
+      <w:pPr>
+        <w:tabs>
+          <w:tab w:val="num" w:pos="720"/>
+        </w:tabs>
+        <w:ind w:left="720" w:hanging="360"/>
+      </w:pPr>
+    </w:lvl>
+    <w:lvl w:ilvl="1" w:tentative="1">
+      <w:start w:val="1"/>
+      <w:numFmt w:val="decimal"/>
+      <w:lvlText w:val="%2."/>
+      <w:lvlJc w:val="left"/>
+      <w:pPr>
+        <w:tabs>
+          <w:tab w:val="num" w:pos="1440"/>
+        </w:tabs>
+        <w:ind w:left="1440" w:hanging="360"/>
+      </w:pPr>
+    </w:lvl>
+    <w:lvl w:ilvl="2" w:tentative="1">
+      <w:start w:val="1"/>
+      <w:numFmt w:val="decimal"/>
+      <w:lvlText w:val="%3."/>
+      <w:lvlJc w:val="left"/>
+      <w:pPr>
+        <w:tabs>
+          <w:tab w:val="num" w:pos="2160"/>
+        </w:tabs>
+        <w:ind w:left="2160" w:hanging="360"/>
+      </w:pPr>
+    </w:lvl>
+    <w:lvl w:ilvl="3" w:tentative="1">
+      <w:start w:val="1"/>
+      <w:numFmt w:val="decimal"/>
+      <w:lvlText w:val="%4."/>
+      <w:lvlJc w:val="left"/>
+      <w:pPr>
+        <w:tabs>
+          <w:tab w:val="num" w:pos="2880"/>
+        </w:tabs>
+        <w:ind w:left="2880" w:hanging="360"/>
+      </w:pPr>
+    </w:lvl>
+    <w:lvl w:ilvl="4" w:tentative="1">
+      <w:start w:val="1"/>
+      <w:numFmt w:val="decimal"/>
+      <w:lvlText w:val="%5."/>
+      <w:lvlJc w:val="left"/>
+      <w:pPr>
+        <w:tabs>
+          <w:tab w:val="num" w:pos="3600"/>
+        </w:tabs>
+        <w:ind w:left="3600" w:hanging="360"/>
+      </w:pPr>
+    </w:lvl>
+    <w:lvl w:ilvl="5" w:tentative="1">
+      <w:start w:val="1"/>
+      <w:numFmt w:val="decimal"/>
+      <w:lvlText w:val="%6."/>
+      <w:lvlJc w:val="left"/>
+      <w:pPr>
+        <w:tabs>
+          <w:tab w:val="num" w:pos="4320"/>
+        </w:tabs>
+        <w:ind w:left="4320" w:hanging="360"/>
+      </w:pPr>
+    </w:lvl>
+    <w:lvl w:ilvl="6" w:tentative="1">
+      <w:start w:val="1"/>
+      <w:numFmt w:val="decimal"/>
+      <w:lvlText w:val="%7."/>
+      <w:lvlJc w:val="left"/>
+      <w:pPr>
+        <w:tabs>
+          <w:tab w:val="num" w:pos="5040"/>
+        </w:tabs>
+        <w:ind w:left="5040" w:hanging="360"/>
+      </w:pPr>
+    </w:lvl>
+    <w:lvl w:ilvl="7" w:tentative="1">
+      <w:start w:val="1"/>
+      <w:numFmt w:val="decimal"/>
+      <w:lvlText w:val="%8."/>
+      <w:lvlJc w:val="left"/>
+      <w:pPr>
+        <w:tabs>
+          <w:tab w:val="num" w:pos="5760"/>
+        </w:tabs>
+        <w:ind w:left="5760" w:hanging="360"/>
+      </w:pPr>
+    </w:lvl>
+    <w:lvl w:ilvl="8" w:tentative="1">
+      <w:start w:val="1"/>
+      <w:numFmt w:val="decimal"/>
+      <w:lvlText w:val="%9."/>
+      <w:lvlJc w:val="left"/>
+      <w:pPr>
+        <w:tabs>
+          <w:tab w:val="num" w:pos="6480"/>
+        </w:tabs>
+        <w:ind w:left="6480" w:hanging="360"/>
+      </w:pPr>
+    </w:lvl>
+  </w:abstractNum>
+  <w:abstractNum w:abstractNumId="2" w15:restartNumberingAfterBreak="0">
+    <w:nsid w:val="29251FE8"/>
+    <w:multiLevelType w:val="multilevel"/>
+    <w:tmpl w:val="5D18EF04"/>
+    <w:lvl w:ilvl="0">
+      <w:start w:val="1"/>
+      <w:numFmt w:val="decimal"/>
+      <w:lvlText w:val="%1."/>
+      <w:lvlJc w:val="left"/>
+      <w:pPr>
+        <w:tabs>
+          <w:tab w:val="num" w:pos="720"/>
+        </w:tabs>
+        <w:ind w:left="720" w:hanging="360"/>
+      </w:pPr>
+    </w:lvl>
+    <w:lvl w:ilvl="1" w:tentative="1">
+      <w:start w:val="1"/>
+      <w:numFmt w:val="decimal"/>
+      <w:lvlText w:val="%2."/>
+      <w:lvlJc w:val="left"/>
+      <w:pPr>
+        <w:tabs>
+          <w:tab w:val="num" w:pos="1440"/>
+        </w:tabs>
+        <w:ind w:left="1440" w:hanging="360"/>
+      </w:pPr>
+    </w:lvl>
+    <w:lvl w:ilvl="2" w:tentative="1">
+      <w:start w:val="1"/>
+      <w:numFmt w:val="decimal"/>
+      <w:lvlText w:val="%3."/>
+      <w:lvlJc w:val="left"/>
+      <w:pPr>
+        <w:tabs>
+          <w:tab w:val="num" w:pos="2160"/>
+        </w:tabs>
+        <w:ind w:left="2160" w:hanging="360"/>
+      </w:pPr>
+    </w:lvl>
+    <w:lvl w:ilvl="3" w:tentative="1">
+      <w:start w:val="1"/>
+      <w:numFmt w:val="decimal"/>
+      <w:lvlText w:val="%4."/>
+      <w:lvlJc w:val="left"/>
+      <w:pPr>
+        <w:tabs>
+          <w:tab w:val="num" w:pos="2880"/>
+        </w:tabs>
+        <w:ind w:left="2880" w:hanging="360"/>
+      </w:pPr>
+    </w:lvl>
+    <w:lvl w:ilvl="4" w:tentative="1">
+      <w:start w:val="1"/>
+      <w:numFmt w:val="decimal"/>
+      <w:lvlText w:val="%5."/>
+      <w:lvlJc w:val="left"/>
+      <w:pPr>
+        <w:tabs>
+          <w:tab w:val="num" w:pos="3600"/>
+        </w:tabs>
+        <w:ind w:left="3600" w:hanging="360"/>
+      </w:pPr>
+    </w:lvl>
+    <w:lvl w:ilvl="5" w:tentative="1">
+      <w:start w:val="1"/>
+      <w:numFmt w:val="decimal"/>
+      <w:lvlText w:val="%6."/>
+      <w:lvlJc w:val="left"/>
+      <w:pPr>
+        <w:tabs>
+          <w:tab w:val="num" w:pos="4320"/>
+        </w:tabs>
+        <w:ind w:left="4320" w:hanging="360"/>
+      </w:pPr>
+    </w:lvl>
+    <w:lvl w:ilvl="6" w:tentative="1">
+      <w:start w:val="1"/>
+      <w:numFmt w:val="decimal"/>
+      <w:lvlText w:val="%7."/>
+      <w:lvlJc w:val="left"/>
+      <w:pPr>
+        <w:tabs>
+          <w:tab w:val="num" w:pos="5040"/>
+        </w:tabs>
+        <w:ind w:left="5040" w:hanging="360"/>
+      </w:pPr>
+    </w:lvl>
+    <w:lvl w:ilvl="7" w:tentative="1">
+      <w:start w:val="1"/>
+      <w:numFmt w:val="decimal"/>
+      <w:lvlText w:val="%8."/>
+      <w:lvlJc w:val="left"/>
+      <w:pPr>
+        <w:tabs>
+          <w:tab w:val="num" w:pos="5760"/>
+        </w:tabs>
+        <w:ind w:left="5760" w:hanging="360"/>
+      </w:pPr>
+    </w:lvl>
+    <w:lvl w:ilvl="8" w:tentative="1">
+      <w:start w:val="1"/>
+      <w:numFmt w:val="decimal"/>
+      <w:lvlText w:val="%9."/>
+      <w:lvlJc w:val="left"/>
+      <w:pPr>
+        <w:tabs>
+          <w:tab w:val="num" w:pos="6480"/>
+        </w:tabs>
+        <w:ind w:left="6480" w:hanging="360"/>
+      </w:pPr>
+    </w:lvl>
+  </w:abstractNum>
+  <w:abstractNum w:abstractNumId="3" w15:restartNumberingAfterBreak="0">
+    <w:nsid w:val="315F4789"/>
+    <w:multiLevelType w:val="multilevel"/>
+    <w:tmpl w:val="4E1E2DA4"/>
+    <w:lvl w:ilvl="0">
+      <w:start w:val="1"/>
+      <w:numFmt w:val="bullet"/>
+      <w:lvlText w:val=""/>
+      <w:lvlJc w:val="left"/>
+      <w:pPr>
+        <w:tabs>
+          <w:tab w:val="num" w:pos="720"/>
+        </w:tabs>
+        <w:ind w:left="720" w:hanging="360"/>
+      </w:pPr>
+      <w:rPr>
+        <w:rFonts w:ascii="Symbol" w:hAnsi="Symbol" w:hint="default"/>
+        <w:sz w:val="20"/>
+      </w:rPr>
+    </w:lvl>
+    <w:lvl w:ilvl="1">
+      <w:start w:val="1"/>
+      <w:numFmt w:val="bullet"/>
+      <w:lvlText w:val="o"/>
+      <w:lvlJc w:val="left"/>
+      <w:pPr>
+        <w:tabs>
+          <w:tab w:val="num" w:pos="1440"/>
+        </w:tabs>
+        <w:ind w:left="1440" w:hanging="360"/>
+      </w:pPr>
+      <w:rPr>
+        <w:rFonts w:ascii="Courier New" w:hAnsi="Courier New" w:hint="default"/>
+        <w:sz w:val="20"/>
+      </w:rPr>
+    </w:lvl>
+    <w:lvl w:ilvl="2" w:tentative="1">
+      <w:start w:val="1"/>
+      <w:numFmt w:val="bullet"/>
+      <w:lvlText w:val=""/>
+      <w:lvlJc w:val="left"/>
+      <w:pPr>
+        <w:tabs>
+          <w:tab w:val="num" w:pos="2160"/>
+        </w:tabs>
+        <w:ind w:left="2160" w:hanging="360"/>
+      </w:pPr>
+      <w:rPr>
+        <w:rFonts w:ascii="Wingdings" w:hAnsi="Wingdings" w:hint="default"/>
+        <w:sz w:val="20"/>
+      </w:rPr>
+    </w:lvl>
+    <w:lvl w:ilvl="3" w:tentative="1">
+      <w:start w:val="1"/>
+      <w:numFmt w:val="bullet"/>
+      <w:lvlText w:val=""/>
+      <w:lvlJc w:val="left"/>
+      <w:pPr>
+        <w:tabs>
+          <w:tab w:val="num" w:pos="2880"/>
+        </w:tabs>
+        <w:ind w:left="2880" w:hanging="360"/>
+      </w:pPr>
+      <w:rPr>
+        <w:rFonts w:ascii="Wingdings" w:hAnsi="Wingdings" w:hint="default"/>
+        <w:sz w:val="20"/>
+      </w:rPr>
+    </w:lvl>
+    <w:lvl w:ilvl="4" w:tentative="1">
+      <w:start w:val="1"/>
+      <w:numFmt w:val="bullet"/>
+      <w:lvlText w:val=""/>
+      <w:lvlJc w:val="left"/>
+      <w:pPr>
+        <w:tabs>
+          <w:tab w:val="num" w:pos="3600"/>
+        </w:tabs>
+        <w:ind w:left="3600" w:hanging="360"/>
+      </w:pPr>
+      <w:rPr>
+        <w:rFonts w:ascii="Wingdings" w:hAnsi="Wingdings" w:hint="default"/>
+        <w:sz w:val="20"/>
+      </w:rPr>
+    </w:lvl>
+    <w:lvl w:ilvl="5" w:tentative="1">
+      <w:start w:val="1"/>
+      <w:numFmt w:val="bullet"/>
+      <w:lvlText w:val=""/>
+      <w:lvlJc w:val="left"/>
+      <w:pPr>
+        <w:tabs>
+          <w:tab w:val="num" w:pos="4320"/>
+        </w:tabs>
+        <w:ind w:left="4320" w:hanging="360"/>
+      </w:pPr>
+      <w:rPr>
+        <w:rFonts w:ascii="Wingdings" w:hAnsi="Wingdings" w:hint="default"/>
+        <w:sz w:val="20"/>
+      </w:rPr>
+    </w:lvl>
+    <w:lvl w:ilvl="6" w:tentative="1">
+      <w:start w:val="1"/>
+      <w:numFmt w:val="bullet"/>
+      <w:lvlText w:val=""/>
+      <w:lvlJc w:val="left"/>
+      <w:pPr>
+        <w:tabs>
+          <w:tab w:val="num" w:pos="5040"/>
+        </w:tabs>
+        <w:ind w:left="5040" w:hanging="360"/>
+      </w:pPr>
+      <w:rPr>
+        <w:rFonts w:ascii="Wingdings" w:hAnsi="Wingdings" w:hint="default"/>
+        <w:sz w:val="20"/>
+      </w:rPr>
+    </w:lvl>
+    <w:lvl w:ilvl="7" w:tentative="1">
+      <w:start w:val="1"/>
+      <w:numFmt w:val="bullet"/>
+      <w:lvlText w:val=""/>
+      <w:lvlJc w:val="left"/>
+      <w:pPr>
+        <w:tabs>
+          <w:tab w:val="num" w:pos="5760"/>
+        </w:tabs>
+        <w:ind w:left="5760" w:hanging="360"/>
+      </w:pPr>
+      <w:rPr>
+        <w:rFonts w:ascii="Wingdings" w:hAnsi="Wingdings" w:hint="default"/>
+        <w:sz w:val="20"/>
+      </w:rPr>
+    </w:lvl>
+    <w:lvl w:ilvl="8" w:tentative="1">
+      <w:start w:val="1"/>
+      <w:numFmt w:val="bullet"/>
+      <w:lvlText w:val=""/>
+      <w:lvlJc w:val="left"/>
+      <w:pPr>
+        <w:tabs>
+          <w:tab w:val="num" w:pos="6480"/>
+        </w:tabs>
+        <w:ind w:left="6480" w:hanging="360"/>
+      </w:pPr>
+      <w:rPr>
+        <w:rFonts w:ascii="Wingdings" w:hAnsi="Wingdings" w:hint="default"/>
+        <w:sz w:val="20"/>
+      </w:rPr>
+    </w:lvl>
+  </w:abstractNum>
+  <w:num w:numId="1" w16cid:durableId="679546970">
+    <w:abstractNumId w:val="1"/>
+  </w:num>
+  <w:num w:numId="2" w16cid:durableId="71661984">
+    <w:abstractNumId w:val="0"/>
+  </w:num>
+  <w:num w:numId="3" w16cid:durableId="319118483">
+    <w:abstractNumId w:val="2"/>
+  </w:num>
+  <w:num w:numId="4" w16cid:durableId="740837657">
+    <w:abstractNumId w:val="3"/>
+  </w:num>
+</w:numbering>
 </file>
 
 <file path=word/styles.xml><?xml version="1.0" encoding="utf-8"?>

</xml_diff>

<commit_message>
changed the wording a little
final
</commit_message>
<xml_diff>
--- a/book-scrape/project specifications.docx
+++ b/book-scrape/project specifications.docx
@@ -43,7 +43,7 @@
     </w:p>
     <w:p>
       <w:r>
-        <w:t xml:space="preserve">This program is a menu-based application that scrapes book data from </w:t>
+        <w:t xml:space="preserve">This program is a menu-based app that scrapes book data from </w:t>
       </w:r>
       <w:r>
         <w:rPr>
@@ -53,7 +53,19 @@
         <w:t>books.toscrape.com</w:t>
       </w:r>
       <w:r>
-        <w:t>. It allows users to view and search book information such as title, price, availability, and rating. The program is useful because it provides a simple way to explore book data collected from a website.</w:t>
+        <w:t xml:space="preserve">. It  </w:t>
+      </w:r>
+      <w:r>
+        <w:t xml:space="preserve">lets </w:t>
+      </w:r>
+      <w:r>
+        <w:t xml:space="preserve">users view and search book info </w:t>
+      </w:r>
+      <w:r>
+        <w:t>like</w:t>
+      </w:r>
+      <w:r>
+        <w:t xml:space="preserve"> title, price, availability, and rating. The program is useful because it provides a simple way to explore book data collected from a website.</w:t>
       </w:r>
     </w:p>
     <w:p>
@@ -120,7 +132,7 @@
         </w:rPr>
         <w:lastRenderedPageBreak/>
         <w:drawing>
-          <wp:inline distT="0" distB="0" distL="0" distR="0" wp14:anchorId="793DB50E" wp14:editId="7FD85A5D">
+          <wp:inline distT="0" distB="0" distL="0" distR="0" wp14:anchorId="793DB50E" wp14:editId="051CD6AE">
             <wp:extent cx="5943600" cy="3713480"/>
             <wp:effectExtent l="0" t="0" r="0" b="1270"/>
             <wp:docPr id="2" name="Picture 2" descr="A computer screen shot of a computer program&#10;&#10;AI-generated content may be incorrect."/>
@@ -227,25 +239,7 @@
           <w:b/>
           <w:bCs/>
         </w:rPr>
-        <w:t xml:space="preserve">The program will automatically scrape book data and save it to </w:t>
-      </w:r>
-      <w:proofErr w:type="spellStart"/>
-      <w:proofErr w:type="gramStart"/>
-      <w:r>
-        <w:rPr>
-          <w:b/>
-          <w:bCs/>
-        </w:rPr>
-        <w:t>library.json</w:t>
-      </w:r>
-      <w:proofErr w:type="spellEnd"/>
-      <w:proofErr w:type="gramEnd"/>
-      <w:r>
-        <w:rPr>
-          <w:b/>
-          <w:bCs/>
-        </w:rPr>
-        <w:t xml:space="preserve">. </w:t>
+        <w:t xml:space="preserve">The program will automatically scrape book data and save it to library.json. </w:t>
       </w:r>
     </w:p>
     <w:p>
@@ -1607,6 +1601,7 @@
   <w:style w:type="character" w:default="1" w:styleId="DefaultParagraphFont">
     <w:name w:val="Default Paragraph Font"/>
     <w:uiPriority w:val="1"/>
+    <w:semiHidden/>
     <w:unhideWhenUsed/>
   </w:style>
   <w:style w:type="table" w:default="1" w:styleId="TableNormal">

</xml_diff>